<commit_message>
docs(report): align Medium severity with the house palette
Medium was F8F200 while the agreed palette is FFFF00. The other four
already matched: Critical C00000, High FFC000, Low 00B050, Informational
00B0F0.

Changed in all six ${cells}/${fill} colour maps — the three findings
overview tables and the three findings blocks — and in the §2.9 Risk
Criteria legend, so the legend still describes what the findings tables
actually show. A legend that disagrees with the table it explains is
worse than either colour on its own.

Claude-Session: https://claude.ai/code/session_01Ph5G1wZpmcguhYaiYsuuzz
Signed-off-by: Wasfy Elbaz <wasfylbaz@gmail.com>
</commit_message>
<xml_diff>
--- a/report-templates/Faction Tuned/1._iSec_MAPT_Template_Faction.docx
+++ b/report-templates/Faction Tuned/1._iSec_MAPT_Template_Faction.docx
@@ -5537,7 +5537,7 @@
               <w:bottom w:val="single" w:sz="4" w:space="0" w:color="BFBFBF"/>
               <w:right w:val="single" w:sz="4" w:space="0" w:color="BFBFBF"/>
             </w:tcBorders>
-            <w:shd w:val="clear" w:color="auto" w:fill="F8F200"/>
+            <w:shd w:val="clear" w:color="auto" w:fill="FFFF00"/>
             <w:vAlign w:val="center"/>
           </w:tcPr>
           <w:p>
@@ -8953,7 +8953,7 @@
               </w:rPr>
             </w:pPr>
             <w:r>
-              <w:t xml:space="preserve">${cells Critical=C00000,High=FFC000,Medium=F8F200,Low=00B050,Informational=00B0F0}</w:t>
+              <w:t xml:space="preserve">${cells Critical=C00000,High=FFC000,Medium=FFFF00,Low=00B050,Informational=00B0F0}</w:t>
             </w:r>
           </w:p>
         </w:tc>
@@ -9400,7 +9400,7 @@
               </w:rPr>
             </w:pPr>
             <w:r>
-              <w:t xml:space="preserve">${cells Critical=C00000,High=FFC000,Medium=F8F200,Low=00B050,Informational=00B0F0}</w:t>
+              <w:t xml:space="preserve">${cells Critical=C00000,High=FFC000,Medium=FFFF00,Low=00B050,Informational=00B0F0}</w:t>
             </w:r>
           </w:p>
         </w:tc>
@@ -9871,7 +9871,7 @@
               </w:rPr>
             </w:pPr>
             <w:r>
-              <w:t xml:space="preserve">${cells Critical=C00000,High=FFC000,Medium=F8F200,Low=00B050,Informational=00B0F0}</w:t>
+              <w:t xml:space="preserve">${cells Critical=C00000,High=FFC000,Medium=FFFF00,Low=00B050,Informational=00B0F0}</w:t>
             </w:r>
           </w:p>
         </w:tc>
@@ -17017,7 +17017,7 @@
         </w:sectPr>
       </w:pPr>
       <w:r>
-        <w:t xml:space="preserve">${fill Critical=C00000,High=FFC000,Medium=F8F200,Low=00B050,Informational=00B0F0}</w:t>
+        <w:t xml:space="preserve">${fill Critical=C00000,High=FFC000,Medium=FFFF00,Low=00B050,Informational=00B0F0}</w:t>
       </w:r>
     </w:p>
     <w:p>
@@ -17906,7 +17906,7 @@
         </w:sectPr>
       </w:pPr>
       <w:r>
-        <w:t xml:space="preserve">${fill Critical=C00000,High=FFC000,Medium=F8F200,Low=00B050,Informational=00B0F0}</w:t>
+        <w:t xml:space="preserve">${fill Critical=C00000,High=FFC000,Medium=FFFF00,Low=00B050,Informational=00B0F0}</w:t>
       </w:r>
     </w:p>
     <w:p>
@@ -18795,7 +18795,7 @@
         </w:sectPr>
       </w:pPr>
       <w:r>
-        <w:t xml:space="preserve">${fill Critical=C00000,High=FFC000,Medium=F8F200,Low=00B050,Informational=00B0F0}</w:t>
+        <w:t xml:space="preserve">${fill Critical=C00000,High=FFC000,Medium=FFFF00,Low=00B050,Informational=00B0F0}</w:t>
       </w:r>
     </w:p>
     <w:p>

</xml_diff>